<commit_message>
chore: preparing for MN1
</commit_message>
<xml_diff>
--- a/51IP Injenerija prykladnyh zastosunkiv/1/IP1_KNT-116m_Onyshchenko_15.docx
+++ b/51IP Injenerija prykladnyh zastosunkiv/1/IP1_KNT-116m_Onyshchenko_15.docx
@@ -254,7 +254,23 @@
       </w:pPr>
       <w:r>
         <w:rPr/>
-        <w:t xml:space="preserve">Студент КНТ-122 </w:t>
+        <w:t>Студент КНТ-</w:t>
+      </w:r>
+      <w:r>
+        <w:rPr>
+          <w:lang w:val="en-US"/>
+        </w:rPr>
+        <w:t>1</w:t>
+      </w:r>
+      <w:r>
+        <w:rPr>
+          <w:lang w:val="uk-UA"/>
+        </w:rPr>
+        <w:t>16м</w:t>
+      </w:r>
+      <w:r>
+        <w:rPr/>
+        <w:t xml:space="preserve"> </w:t>
         <w:tab/>
         <w:tab/>
         <w:tab/>
@@ -813,9 +829,9 @@
       </w:pPr>
       <w:r>
         <w:rPr>
-          <w:lang w:val="en-US"/>
+          <w:lang w:val="uk-UA"/>
         </w:rPr>
-        <w:t>Y</w:t>
+        <w:t>Н</w:t>
       </w:r>
       <w:r>
         <w:rPr>
@@ -2780,11 +2796,6 @@
     <w:p>
       <w:pPr>
         <w:pStyle w:val="h11"/>
-        <w:numPr>
-          <w:ilvl w:val="0"/>
-          <w:numId w:val="0"/>
-        </w:numPr>
-        <w:ind w:hanging="0" w:left="720"/>
         <w:rPr/>
       </w:pPr>
       <w:r>
@@ -4280,8 +4291,8 @@
       <w:lang w:val="en-US" w:eastAsia="uk-UA"/>
     </w:rPr>
   </w:style>
-  <w:style w:type="character" w:styleId="Style12">
-    <w:name w:val="Символ нумерації"/>
+  <w:style w:type="character" w:styleId="user">
+    <w:name w:val="Символ нумерації (user)"/>
     <w:qFormat/>
     <w:rPr/>
   </w:style>
@@ -4292,14 +4303,14 @@
       <w:u w:val="single"/>
     </w:rPr>
   </w:style>
-  <w:style w:type="character" w:styleId="Style13">
-    <w:name w:val="Маркери"/>
+  <w:style w:type="character" w:styleId="user1">
+    <w:name w:val="Маркери (user)"/>
     <w:qFormat/>
     <w:rPr>
       <w:rFonts w:ascii="OpenSymbol" w:hAnsi="OpenSymbol" w:eastAsia="OpenSymbol" w:cs="OpenSymbol"/>
     </w:rPr>
   </w:style>
-  <w:style w:type="paragraph" w:styleId="Style14">
+  <w:style w:type="paragraph" w:styleId="Style12">
     <w:name w:val="Заголовок"/>
     <w:basedOn w:val="Normal"/>
     <w:next w:val="BodyText"/>
@@ -4309,7 +4320,7 @@
       <w:spacing w:before="240" w:after="120"/>
     </w:pPr>
     <w:rPr>
-      <w:rFonts w:ascii="Liberation Sans" w:hAnsi="Liberation Sans" w:eastAsia="Microsoft YaHei" w:cs="Lucida Sans"/>
+      <w:rFonts w:ascii="Liberation Sans" w:hAnsi="Liberation Sans" w:eastAsia="Microsoft YaHei" w:cs="Arial Unicode MS"/>
       <w:sz w:val="28"/>
       <w:szCs w:val="28"/>
     </w:rPr>
@@ -4346,8 +4357,34 @@
       <w:szCs w:val="24"/>
     </w:rPr>
   </w:style>
-  <w:style w:type="paragraph" w:styleId="Style15">
+  <w:style w:type="paragraph" w:styleId="Style13">
     <w:name w:val="Покажчик"/>
+    <w:basedOn w:val="Normal"/>
+    <w:qFormat/>
+    <w:pPr>
+      <w:suppressLineNumbers/>
+    </w:pPr>
+    <w:rPr>
+      <w:rFonts w:cs="Arial Unicode MS"/>
+    </w:rPr>
+  </w:style>
+  <w:style w:type="paragraph" w:styleId="user2">
+    <w:name w:val="Заголовок (user)"/>
+    <w:basedOn w:val="Normal"/>
+    <w:next w:val="BodyText"/>
+    <w:qFormat/>
+    <w:pPr>
+      <w:keepNext w:val="true"/>
+      <w:spacing w:before="240" w:after="120"/>
+    </w:pPr>
+    <w:rPr>
+      <w:rFonts w:ascii="Liberation Sans" w:hAnsi="Liberation Sans" w:eastAsia="Microsoft YaHei" w:cs="Lucida Sans"/>
+      <w:sz w:val="28"/>
+      <w:szCs w:val="28"/>
+    </w:rPr>
+  </w:style>
+  <w:style w:type="paragraph" w:styleId="user3">
+    <w:name w:val="Покажчик (user)"/>
     <w:basedOn w:val="Normal"/>
     <w:qFormat/>
     <w:pPr>
@@ -4357,35 +4394,9 @@
       <w:rFonts w:cs="Lucida Sans"/>
     </w:rPr>
   </w:style>
-  <w:style w:type="paragraph" w:styleId="user">
-    <w:name w:val="Заголовок (user)"/>
-    <w:basedOn w:val="Normal"/>
-    <w:next w:val="BodyText"/>
-    <w:qFormat/>
-    <w:pPr>
-      <w:keepNext w:val="true"/>
-      <w:spacing w:before="240" w:after="120"/>
-    </w:pPr>
-    <w:rPr>
-      <w:rFonts w:ascii="Liberation Sans" w:hAnsi="Liberation Sans" w:eastAsia="Microsoft YaHei" w:cs="Arial Unicode MS"/>
-      <w:sz w:val="28"/>
-      <w:szCs w:val="28"/>
-    </w:rPr>
-  </w:style>
-  <w:style w:type="paragraph" w:styleId="user1">
-    <w:name w:val="Покажчик (user)"/>
-    <w:basedOn w:val="Normal"/>
-    <w:qFormat/>
-    <w:pPr>
-      <w:suppressLineNumbers/>
-    </w:pPr>
-    <w:rPr>
-      <w:rFonts w:cs="Arial Unicode MS"/>
-    </w:rPr>
-  </w:style>
   <w:style w:type="paragraph" w:styleId="IndexHeading">
     <w:name w:val="index heading"/>
-    <w:basedOn w:val="user"/>
+    <w:basedOn w:val="Style12"/>
     <w:pPr/>
     <w:rPr/>
   </w:style>
@@ -4661,8 +4672,8 @@
     </w:pPr>
     <w:rPr/>
   </w:style>
-  <w:style w:type="paragraph" w:styleId="Style16">
-    <w:name w:val="Верхній і нижній колонтитули"/>
+  <w:style w:type="paragraph" w:styleId="user4">
+    <w:name w:val="Верхній і нижній колонтитули (user)"/>
     <w:basedOn w:val="Normal"/>
     <w:qFormat/>
     <w:pPr>
@@ -4675,8 +4686,8 @@
     </w:pPr>
     <w:rPr/>
   </w:style>
-  <w:style w:type="paragraph" w:styleId="user2">
-    <w:name w:val="Верхній і нижній колонтитули (user)"/>
+  <w:style w:type="paragraph" w:styleId="Style14">
+    <w:name w:val="Верхній і нижній колонтитули"/>
     <w:basedOn w:val="Normal"/>
     <w:qFormat/>
     <w:pPr/>
@@ -4684,14 +4695,14 @@
   </w:style>
   <w:style w:type="paragraph" w:styleId="Header">
     <w:name w:val="header"/>
-    <w:basedOn w:val="Style16"/>
+    <w:basedOn w:val="user4"/>
     <w:pPr>
       <w:suppressLineNumbers/>
     </w:pPr>
     <w:rPr/>
   </w:style>
-  <w:style w:type="numbering" w:styleId="user3" w:default="1">
-    <w:name w:val="Без маркерів (user)"/>
+  <w:style w:type="numbering" w:styleId="Style15" w:default="1">
+    <w:name w:val="Без маркерів"/>
     <w:uiPriority w:val="99"/>
     <w:semiHidden/>
     <w:unhideWhenUsed/>

</xml_diff>